<commit_message>
Update Project Links with the published YouTube video URL
Replaces the placeholder with the real link (youtu.be/WNg52rptkoU) in
report.md and video_script.md; rebuilds report.docx, full_submission,
and final_submission.pdf/.docx.

Re-verified all five supervisor feedback items are present in this
build: keywords below the abstract, the layered XLS-R architecture
diagram as Figure 1, the proposal verbatim in Appendix A, the trimmed
code/screenshot appendices, and both GitHub and YouTube links visible
on page 3.

Co-Authored-By: Claude Sonnet 5 <noreply@anthropic.com>
</commit_message>
<xml_diff>
--- a/final_submission.docx
+++ b/final_submission.docx
@@ -54,7 +54,7 @@
         <w:pStyle w:val="BodyText"/>
       </w:pPr>
     </w:p>
-    <w:bookmarkStart w:id="42" w:name="X0c2e8d5000bd4e7f7602f311ec23643908b0291"/>
+    <w:bookmarkStart w:id="43" w:name="X0c2e8d5000bd4e7f7602f311ec23643908b0291"/>
     <w:p>
       <w:pPr>
         <w:pStyle w:val="Heading1"/>
@@ -917,7 +917,7 @@
       </w:r>
     </w:p>
     <w:bookmarkEnd w:id="14"/>
-    <w:bookmarkStart w:id="16" w:name="project-links"/>
+    <w:bookmarkStart w:id="17" w:name="project-links"/>
     <w:p>
       <w:pPr>
         <w:pStyle w:val="Heading2"/>
@@ -981,16 +981,17 @@
       <w:r>
         <w:t xml:space="preserve"> </w:t>
       </w:r>
-      <w:r>
-        <w:rPr>
-          <w:i/>
-          <w:iCs/>
-        </w:rPr>
-        <w:t xml:space="preserve">[link to be added — video not yet recorded/published]</w:t>
-      </w:r>
+      <w:hyperlink r:id="rId16">
+        <w:r>
+          <w:rPr>
+            <w:rStyle w:val="Hyperlink"/>
+          </w:rPr>
+          <w:t xml:space="preserve">youtu.be/WNg52rptkoU</w:t>
+        </w:r>
+      </w:hyperlink>
     </w:p>
-    <w:bookmarkEnd w:id="16"/>
-    <w:bookmarkStart w:id="17" w:name="introduction"/>
+    <w:bookmarkEnd w:id="17"/>
+    <w:bookmarkStart w:id="18" w:name="introduction"/>
     <w:p>
       <w:pPr>
         <w:pStyle w:val="Heading2"/>
@@ -1067,8 +1068,8 @@
         <w:t xml:space="preserve">The remainder of this report proceeds as follows: Section 2 situates this work against XLS-R, low-resource ASR benchmarking practice, and quantization; Section 3 formalises the two tasks and the pipeline connecting them; Section 4 reports the experimental results for both tasks plus the ablation, error analysis, and efficiency benchmark; Section 5 discusses what these results mean and their limitations; Section 6 concludes.</w:t>
       </w:r>
     </w:p>
-    <w:bookmarkEnd w:id="17"/>
-    <w:bookmarkStart w:id="18" w:name="background-related-work"/>
+    <w:bookmarkEnd w:id="18"/>
+    <w:bookmarkStart w:id="19" w:name="background-related-work"/>
     <w:p>
       <w:pPr>
         <w:pStyle w:val="Heading2"/>
@@ -1243,8 +1244,8 @@
         <w:t xml:space="preserve">, whose dynamic-quantization kernels do not universally outperform native FP32 execution. Section 4.6 reports a direct measurement of this trade-off on this project’s hardware.</w:t>
       </w:r>
     </w:p>
-    <w:bookmarkEnd w:id="18"/>
-    <w:bookmarkStart w:id="31" w:name="problem-tasks-method"/>
+    <w:bookmarkEnd w:id="19"/>
+    <w:bookmarkStart w:id="32" w:name="problem-tasks-method"/>
     <w:p>
       <w:pPr>
         <w:pStyle w:val="Heading2"/>
@@ -1253,7 +1254,7 @@
         <w:t xml:space="preserve">3. Problem / Tasks / Method</w:t>
       </w:r>
     </w:p>
-    <w:bookmarkStart w:id="19" w:name="problem-statement"/>
+    <w:bookmarkStart w:id="20" w:name="problem-statement"/>
     <w:p>
       <w:pPr>
         <w:pStyle w:val="Heading3"/>
@@ -1298,8 +1299,8 @@
         <w:t xml:space="preserve">Given that generalisation gap, can fine-tuning the same checkpoint on speaker-diverse data close it, what is the cost to the model’s original narrow-domain performance, and how much of any measured improvement is genuine versus an artefact of failing to control for speaker overlap between training and evaluation data?</w:t>
       </w:r>
     </w:p>
-    <w:bookmarkEnd w:id="19"/>
-    <w:bookmarkStart w:id="26" w:name="system-architecture"/>
+    <w:bookmarkEnd w:id="20"/>
+    <w:bookmarkStart w:id="27" w:name="system-architecture"/>
     <w:p>
       <w:pPr>
         <w:pStyle w:val="Heading3"/>
@@ -1341,18 +1342,18 @@
           <wp:inline>
             <wp:extent cx="5334000" cy="6978285"/>
             <wp:effectExtent b="0" l="0" r="0" t="0"/>
-            <wp:docPr descr="Figure 1. XLS-R (wav2vec2) architecture, showing the CNN feature encoder, transformer encoder, and CTC head, with frozen vs. fine-tuned components marked." title="" id="21" name="Picture"/>
+            <wp:docPr descr="Figure 1. XLS-R (wav2vec2) architecture, showing the CNN feature encoder, transformer encoder, and CTC head, with frozen vs. fine-tuned components marked." title="" id="22" name="Picture"/>
             <a:graphic>
               <a:graphicData uri="http://schemas.openxmlformats.org/drawingml/2006/picture">
                 <pic:pic>
                   <pic:nvPicPr>
-                    <pic:cNvPr descr="appendix_screenshots/figure1_architecture.png" id="22" name="Picture"/>
+                    <pic:cNvPr descr="appendix_screenshots/figure1_architecture.png" id="23" name="Picture"/>
                     <pic:cNvPicPr>
                       <a:picLocks noChangeArrowheads="1" noChangeAspect="1"/>
                     </pic:cNvPicPr>
                   </pic:nvPicPr>
                   <pic:blipFill>
-                    <a:blip r:embed="rId20"/>
+                    <a:blip r:embed="rId21"/>
                     <a:stretch>
                       <a:fillRect/>
                     </a:stretch>
@@ -1404,18 +1405,18 @@
           <wp:inline>
             <wp:extent cx="5334000" cy="3655887"/>
             <wp:effectExtent b="0" l="0" r="0" t="0"/>
-            <wp:docPr descr="Figure 2. Experimental pipeline: from the audited checkpoint through both tasks to the shared downstream analyses." title="" id="24" name="Picture"/>
+            <wp:docPr descr="Figure 2. Experimental pipeline: from the audited checkpoint through both tasks to the shared downstream analyses." title="" id="25" name="Picture"/>
             <a:graphic>
               <a:graphicData uri="http://schemas.openxmlformats.org/drawingml/2006/picture">
                 <pic:pic>
                   <pic:nvPicPr>
-                    <pic:cNvPr descr="appendix_screenshots/figure1_pipeline.png" id="25" name="Picture"/>
+                    <pic:cNvPr descr="appendix_screenshots/figure1_pipeline.png" id="26" name="Picture"/>
                     <pic:cNvPicPr>
                       <a:picLocks noChangeArrowheads="1" noChangeAspect="1"/>
                     </pic:cNvPicPr>
                   </pic:nvPicPr>
                   <pic:blipFill>
-                    <a:blip r:embed="rId23"/>
+                    <a:blip r:embed="rId24"/>
                     <a:stretch>
                       <a:fillRect/>
                     </a:stretch>
@@ -1450,8 +1451,8 @@
         <w:t xml:space="preserve">Figure 2. Experimental pipeline: from the audited checkpoint through both tasks to the shared downstream analyses.</w:t>
       </w:r>
     </w:p>
-    <w:bookmarkEnd w:id="26"/>
-    <w:bookmarkStart w:id="27" w:name="dataset"/>
+    <w:bookmarkEnd w:id="27"/>
+    <w:bookmarkStart w:id="28" w:name="dataset"/>
     <w:p>
       <w:pPr>
         <w:pStyle w:val="Heading3"/>
@@ -1628,8 +1629,8 @@
         <w:t xml:space="preserve">.</w:t>
       </w:r>
     </w:p>
-    <w:bookmarkEnd w:id="27"/>
-    <w:bookmarkStart w:id="28" w:name="preprocessing"/>
+    <w:bookmarkEnd w:id="28"/>
+    <w:bookmarkStart w:id="29" w:name="preprocessing"/>
     <w:p>
       <w:pPr>
         <w:pStyle w:val="Heading3"/>
@@ -1670,8 +1671,8 @@
         <w:t xml:space="preserve">).</w:t>
       </w:r>
     </w:p>
-    <w:bookmarkEnd w:id="28"/>
-    <w:bookmarkStart w:id="29" w:name="task-1-method-benchmark-audit"/>
+    <w:bookmarkEnd w:id="29"/>
+    <w:bookmarkStart w:id="30" w:name="task-1-method-benchmark-audit"/>
     <w:p>
       <w:pPr>
         <w:pStyle w:val="Heading3"/>
@@ -1715,8 +1716,8 @@
         <w:t xml:space="preserve">measurement against which Task 2’s repair is judged.</w:t>
       </w:r>
     </w:p>
-    <w:bookmarkEnd w:id="29"/>
-    <w:bookmarkStart w:id="30" w:name="task-2-method-fine-tuning-repair"/>
+    <w:bookmarkEnd w:id="30"/>
+    <w:bookmarkStart w:id="31" w:name="task-2-method-fine-tuning-repair"/>
     <w:p>
       <w:pPr>
         <w:pStyle w:val="Heading3"/>
@@ -1913,9 +1914,9 @@
         <w:t xml:space="preserve">(utterance-random) split of the same processed records for the Section 4.4 ablation.</w:t>
       </w:r>
     </w:p>
-    <w:bookmarkEnd w:id="30"/>
     <w:bookmarkEnd w:id="31"/>
-    <w:bookmarkStart w:id="37" w:name="experimental-section"/>
+    <w:bookmarkEnd w:id="32"/>
+    <w:bookmarkStart w:id="38" w:name="experimental-section"/>
     <w:p>
       <w:pPr>
         <w:pStyle w:val="Heading2"/>
@@ -1944,7 +1945,7 @@
         <w:t xml:space="preserve">. Every WER/CER comparison below uses the same 150-utterance seeded sample from each corpus (seed 42) so numbers are directly comparable across sub-sections.</w:t>
       </w:r>
     </w:p>
-    <w:bookmarkStart w:id="32" w:name="X99fbbffd03045a9cb72d59a618c94e36607e72b"/>
+    <w:bookmarkStart w:id="33" w:name="X99fbbffd03045a9cb72d59a618c94e36607e72b"/>
     <w:p>
       <w:pPr>
         <w:pStyle w:val="Heading3"/>
@@ -2125,8 +2126,8 @@
         <w:t xml:space="preserve">The in-domain measurement is close to (marginally better than) the published figure, confirming no discrepancy on the model’s own distribution. The out-of-domain measurement is more than twelve times worse. Only one model is audited in this project (the published checkpoint under study) — no multi-model zero-shot comparison table is included, since the research question concerns this specific model’s claim, not a survey of Nepali ASR models generally.</w:t>
       </w:r>
     </w:p>
-    <w:bookmarkEnd w:id="32"/>
-    <w:bookmarkStart w:id="33" w:name="fine-tuned-repair-results-task-2"/>
+    <w:bookmarkEnd w:id="33"/>
+    <w:bookmarkStart w:id="34" w:name="fine-tuned-repair-results-task-2"/>
     <w:p>
       <w:pPr>
         <w:pStyle w:val="Heading3"/>
@@ -2292,8 +2293,8 @@
         <w:t xml:space="preserve">split); the 38.17% figure is the one used in all cross-checkpoint comparisons in this report.</w:t>
       </w:r>
     </w:p>
-    <w:bookmarkEnd w:id="33"/>
-    <w:bookmarkStart w:id="34" w:name="speaker-leakage-ablation"/>
+    <w:bookmarkEnd w:id="34"/>
+    <w:bookmarkStart w:id="35" w:name="speaker-leakage-ablation"/>
     <w:p>
       <w:pPr>
         <w:pStyle w:val="Heading3"/>
@@ -2482,8 +2483,8 @@
         <w:t xml:space="preserve">that reflects memorisation of already-seen speakers, not genuine generalisation.</w:t>
       </w:r>
     </w:p>
-    <w:bookmarkEnd w:id="34"/>
-    <w:bookmarkStart w:id="35" w:name="error-analysis"/>
+    <w:bookmarkEnd w:id="35"/>
+    <w:bookmarkStart w:id="36" w:name="error-analysis"/>
     <w:p>
       <w:pPr>
         <w:pStyle w:val="Heading3"/>
@@ -2734,8 +2735,8 @@
         <w:t xml:space="preserve">: across the 16 speakers represented in the sample, per-speaker mean WER ranges from 12.5% (best, n=12) to 63.6% (worst, n=11) — a five-fold difference the aggregate 38.17% figure obscures entirely. Full per-utterance results are in Appendix D.</w:t>
       </w:r>
     </w:p>
-    <w:bookmarkEnd w:id="35"/>
-    <w:bookmarkStart w:id="36" w:name="deployment-efficiency-benchmark"/>
+    <w:bookmarkEnd w:id="36"/>
+    <w:bookmarkStart w:id="37" w:name="deployment-efficiency-benchmark"/>
     <w:p>
       <w:pPr>
         <w:pStyle w:val="Heading3"/>
@@ -3014,9 +3015,9 @@
         <w:t xml:space="preserve">one.</w:t>
       </w:r>
     </w:p>
-    <w:bookmarkEnd w:id="36"/>
     <w:bookmarkEnd w:id="37"/>
-    <w:bookmarkStart w:id="38" w:name="discussion-of-findings"/>
+    <w:bookmarkEnd w:id="38"/>
+    <w:bookmarkStart w:id="39" w:name="discussion-of-findings"/>
     <w:p>
       <w:pPr>
         <w:pStyle w:val="Heading2"/>
@@ -3145,8 +3146,8 @@
         <w:t xml:space="preserve">This work relates back to the motivating concern in Section 1: published low-resource ASR numbers, including outside this specific project, should be read with the training corpus’s speaker diversity in mind, not taken at face value.</w:t>
       </w:r>
     </w:p>
-    <w:bookmarkEnd w:id="38"/>
-    <w:bookmarkStart w:id="39" w:name="conclusion"/>
+    <w:bookmarkEnd w:id="39"/>
+    <w:bookmarkStart w:id="40" w:name="conclusion"/>
     <w:p>
       <w:pPr>
         <w:pStyle w:val="Heading2"/>
@@ -3163,8 +3164,8 @@
         <w:t xml:space="preserve">This project set out to answer whether a specific published Nepali ASR benchmark claim (5.97% WER) survives contact with speaker-diverse speech (RQ1), and whether the same model can be repaired if not (RQ2). It does not survive: the same checkpoint’s WER rises to 62.30% on a different, multi-speaker corpus. Fine-tuning that checkpoint on a 15-hour, speaker-disjoint, 160-speaker subset repairs a substantial share of that gap (to 38.17% WER), at a disclosed cost to the model’s original narrow-domain sharpness, and a matched-budget ablation confirms this improvement is genuine rather than a leakage artefact. The contribution of this project is an open, reproducible Nepali ASR audit-and-repair case study with an accompanying efficiency benchmark — not a claim of new state-of-the-art performance. Future work would extend the fine-tuning corpus beyond 15 hours, replace the F0-pitch pseudo-label with verified demographic metadata should a real bias analysis be required, and test on conversational or code-switched Nepali speech rather than read speech alone.</w:t>
       </w:r>
     </w:p>
-    <w:bookmarkEnd w:id="39"/>
-    <w:bookmarkStart w:id="40" w:name="references"/>
+    <w:bookmarkEnd w:id="40"/>
+    <w:bookmarkStart w:id="41" w:name="references"/>
     <w:p>
       <w:pPr>
         <w:pStyle w:val="Heading2"/>
@@ -3299,8 +3300,8 @@
         <w:t xml:space="preserve">MLflow documentation (experiment tracking).</w:t>
       </w:r>
     </w:p>
-    <w:bookmarkEnd w:id="40"/>
-    <w:bookmarkStart w:id="41" w:name="appendices-not-counted-in-word-limit"/>
+    <w:bookmarkEnd w:id="41"/>
+    <w:bookmarkStart w:id="42" w:name="appendices-not-counted-in-word-limit"/>
     <w:p>
       <w:pPr>
         <w:pStyle w:val="Heading2"/>
@@ -3426,9 +3427,9 @@
         <w:br w:type="page"/>
       </w:r>
     </w:p>
-    <w:bookmarkEnd w:id="41"/>
     <w:bookmarkEnd w:id="42"/>
-    <w:bookmarkStart w:id="50" w:name="appendix-a-project-proposal-verbatim"/>
+    <w:bookmarkEnd w:id="43"/>
+    <w:bookmarkStart w:id="51" w:name="appendix-a-project-proposal-verbatim"/>
     <w:p>
       <w:pPr>
         <w:pStyle w:val="Heading1"/>
@@ -3437,7 +3438,7 @@
         <w:t xml:space="preserve">Appendix A — Project Proposal (Verbatim)</w:t>
       </w:r>
     </w:p>
-    <w:bookmarkStart w:id="49" w:name="X3a708ef8249b760167a7569dd5d6ce6b5e79933"/>
+    <w:bookmarkStart w:id="50" w:name="X3a708ef8249b760167a7569dd5d6ce6b5e79933"/>
     <w:p>
       <w:pPr>
         <w:pStyle w:val="Heading2"/>
@@ -3512,7 +3513,7 @@
         <w:t xml:space="preserve">250594@softwarica.edu.np</w:t>
       </w:r>
     </w:p>
-    <w:bookmarkStart w:id="43" w:name="problem"/>
+    <w:bookmarkStart w:id="44" w:name="problem"/>
     <w:p>
       <w:pPr>
         <w:pStyle w:val="Heading3"/>
@@ -3640,8 +3641,8 @@
         <w:t xml:space="preserve">then repairs the model.</w:t>
       </w:r>
     </w:p>
-    <w:bookmarkEnd w:id="43"/>
-    <w:bookmarkStart w:id="44" w:name="tasks"/>
+    <w:bookmarkEnd w:id="44"/>
+    <w:bookmarkStart w:id="45" w:name="tasks"/>
     <w:p>
       <w:pPr>
         <w:pStyle w:val="Heading3"/>
@@ -3752,8 +3753,8 @@
         <w:t xml:space="preserve">on the original corpus — plus error analysis and a speaker-leakage ablation.</w:t>
       </w:r>
     </w:p>
-    <w:bookmarkEnd w:id="44"/>
-    <w:bookmarkStart w:id="45" w:name="datasets"/>
+    <w:bookmarkEnd w:id="45"/>
+    <w:bookmarkStart w:id="46" w:name="datasets"/>
     <w:p>
       <w:pPr>
         <w:pStyle w:val="Heading3"/>
@@ -3850,8 +3851,8 @@
         <w:t xml:space="preserve">The two corpora are kept strictly separate in all results.</w:t>
       </w:r>
     </w:p>
-    <w:bookmarkEnd w:id="45"/>
-    <w:bookmarkStart w:id="46" w:name="method-and-infrastructure"/>
+    <w:bookmarkEnd w:id="46"/>
+    <w:bookmarkStart w:id="47" w:name="method-and-infrastructure"/>
     <w:p>
       <w:pPr>
         <w:pStyle w:val="Heading3"/>
@@ -3929,8 +3930,8 @@
         <w:t xml:space="preserve">captured throughout.</w:t>
       </w:r>
     </w:p>
-    <w:bookmarkEnd w:id="46"/>
-    <w:bookmarkStart w:id="47" w:name="work-plan-10-phases"/>
+    <w:bookmarkEnd w:id="47"/>
+    <w:bookmarkStart w:id="48" w:name="work-plan-10-phases"/>
     <w:p>
       <w:pPr>
         <w:pStyle w:val="Heading3"/>
@@ -4218,8 +4219,8 @@
         </w:tc>
       </w:tr>
     </w:tbl>
-    <w:bookmarkEnd w:id="47"/>
-    <w:bookmarkStart w:id="48" w:name="achievability"/>
+    <w:bookmarkEnd w:id="48"/>
+    <w:bookmarkStart w:id="49" w:name="achievability"/>
     <w:p>
       <w:pPr>
         <w:pStyle w:val="Heading3"/>
@@ -4277,10 +4278,10 @@
         <w:br w:type="page"/>
       </w:r>
     </w:p>
-    <w:bookmarkEnd w:id="48"/>
     <w:bookmarkEnd w:id="49"/>
     <w:bookmarkEnd w:id="50"/>
-    <w:bookmarkStart w:id="57" w:name="appendix-b-full-code-listing"/>
+    <w:bookmarkEnd w:id="51"/>
+    <w:bookmarkStart w:id="58" w:name="appendix-b-full-code-listing"/>
     <w:p>
       <w:pPr>
         <w:pStyle w:val="Heading1"/>
@@ -4309,7 +4310,7 @@
         <w:t xml:space="preserve">branch) for complete inspection.</w:t>
       </w:r>
     </w:p>
-    <w:bookmarkStart w:id="51" w:name="srcsplits.py"/>
+    <w:bookmarkStart w:id="52" w:name="srcsplits.py"/>
     <w:p>
       <w:pPr>
         <w:pStyle w:val="Heading2"/>
@@ -7551,8 +7552,8 @@
         <w:t xml:space="preserve">)</w:t>
       </w:r>
     </w:p>
-    <w:bookmarkEnd w:id="51"/>
-    <w:bookmarkStart w:id="52" w:name="srcwer_metrics.py"/>
+    <w:bookmarkEnd w:id="52"/>
+    <w:bookmarkStart w:id="53" w:name="srcwer_metrics.py"/>
     <w:p>
       <w:pPr>
         <w:pStyle w:val="Heading2"/>
@@ -7800,8 +7801,8 @@
         <w:t xml:space="preserve"> wer, cer</w:t>
       </w:r>
     </w:p>
-    <w:bookmarkEnd w:id="52"/>
-    <w:bookmarkStart w:id="53" w:name="srcxlsr_training.py"/>
+    <w:bookmarkEnd w:id="53"/>
+    <w:bookmarkStart w:id="54" w:name="srcxlsr_training.py"/>
     <w:p>
       <w:pPr>
         <w:pStyle w:val="Heading2"/>
@@ -14253,8 +14254,8 @@
         <w:t xml:space="preserve">    }</w:t>
       </w:r>
     </w:p>
-    <w:bookmarkEnd w:id="53"/>
-    <w:bookmarkStart w:id="54" w:name="scriptsmake_leaky_manifests.py"/>
+    <w:bookmarkEnd w:id="54"/>
+    <w:bookmarkStart w:id="55" w:name="scriptsmake_leaky_manifests.py"/>
     <w:p>
       <w:pPr>
         <w:pStyle w:val="Heading2"/>
@@ -15141,8 +15142,8 @@
         <w:t xml:space="preserve">    main()</w:t>
       </w:r>
     </w:p>
-    <w:bookmarkEnd w:id="54"/>
-    <w:bookmarkStart w:id="55" w:name="scriptsrun_efficiency_benchmark.py"/>
+    <w:bookmarkEnd w:id="55"/>
+    <w:bookmarkStart w:id="56" w:name="scriptsrun_efficiency_benchmark.py"/>
     <w:p>
       <w:pPr>
         <w:pStyle w:val="Heading2"/>
@@ -19392,8 +19393,8 @@
         <w:t xml:space="preserve">    main()</w:t>
       </w:r>
     </w:p>
-    <w:bookmarkEnd w:id="55"/>
-    <w:bookmarkStart w:id="56" w:name="scriptsrun_generalization_eval.py"/>
+    <w:bookmarkEnd w:id="56"/>
+    <w:bookmarkStart w:id="57" w:name="scriptsrun_generalization_eval.py"/>
     <w:p>
       <w:pPr>
         <w:pStyle w:val="Heading2"/>
@@ -23861,9 +23862,9 @@
         <w:br w:type="page"/>
       </w:r>
     </w:p>
-    <w:bookmarkEnd w:id="56"/>
     <w:bookmarkEnd w:id="57"/>
-    <w:bookmarkStart w:id="72" w:name="X7bd1d8166aea7649b58b901a2f9feee3fb464e9"/>
+    <w:bookmarkEnd w:id="58"/>
+    <w:bookmarkStart w:id="73" w:name="X7bd1d8166aea7649b58b901a2f9feee3fb464e9"/>
     <w:p>
       <w:pPr>
         <w:pStyle w:val="Heading1"/>
@@ -23892,7 +23893,7 @@
         <w:t xml:space="preserve">branch) for direct inspection, per the reproducibility requirement.</w:t>
       </w:r>
     </w:p>
-    <w:bookmarkStart w:id="61" w:name="c.1-environment"/>
+    <w:bookmarkStart w:id="62" w:name="c.1-environment"/>
     <w:p>
       <w:pPr>
         <w:pStyle w:val="Heading2"/>
@@ -23993,18 +23994,18 @@
           <wp:inline>
             <wp:extent cx="5334000" cy="2667000"/>
             <wp:effectExtent b="0" l="0" r="0" t="0"/>
-            <wp:docPr descr="Terminal output of the environment info script" title="" id="59" name="Picture"/>
+            <wp:docPr descr="Terminal output of the environment info script" title="" id="60" name="Picture"/>
             <a:graphic>
               <a:graphicData uri="http://schemas.openxmlformats.org/drawingml/2006/picture">
                 <pic:pic>
                   <pic:nvPicPr>
-                    <pic:cNvPr descr="appendix_screenshots/07_environment_info.png" id="60" name="Picture"/>
+                    <pic:cNvPr descr="appendix_screenshots/07_environment_info.png" id="61" name="Picture"/>
                     <pic:cNvPicPr>
                       <a:picLocks noChangeArrowheads="1" noChangeAspect="1"/>
                     </pic:cNvPicPr>
                   </pic:nvPicPr>
                   <pic:blipFill>
-                    <a:blip r:embed="rId58"/>
+                    <a:blip r:embed="rId59"/>
                     <a:stretch>
                       <a:fillRect/>
                     </a:stretch>
@@ -24039,8 +24040,8 @@
         <w:t xml:space="preserve">Terminal output of the environment info script</w:t>
       </w:r>
     </w:p>
-    <w:bookmarkEnd w:id="61"/>
-    <w:bookmarkStart w:id="71" w:name="c.2-mlflow-experiment-tracking"/>
+    <w:bookmarkEnd w:id="62"/>
+    <w:bookmarkStart w:id="72" w:name="c.2-mlflow-experiment-tracking"/>
     <w:p>
       <w:pPr>
         <w:pStyle w:val="Heading2"/>
@@ -24141,18 +24142,18 @@
           <wp:inline>
             <wp:extent cx="5334000" cy="1539081"/>
             <wp:effectExtent b="0" l="0" r="0" t="0"/>
-            <wp:docPr descr="MLflow experiments list" title="" id="63" name="Picture"/>
+            <wp:docPr descr="MLflow experiments list" title="" id="64" name="Picture"/>
             <a:graphic>
               <a:graphicData uri="http://schemas.openxmlformats.org/drawingml/2006/picture">
                 <pic:pic>
                   <pic:nvPicPr>
-                    <pic:cNvPr descr="appendix_screenshots/01_experiments_list.png" id="64" name="Picture"/>
+                    <pic:cNvPr descr="appendix_screenshots/01_experiments_list.png" id="65" name="Picture"/>
                     <pic:cNvPicPr>
                       <a:picLocks noChangeArrowheads="1" noChangeAspect="1"/>
                     </pic:cNvPicPr>
                   </pic:nvPicPr>
                   <pic:blipFill>
-                    <a:blip r:embed="rId62"/>
+                    <a:blip r:embed="rId63"/>
                     <a:stretch>
                       <a:fillRect/>
                     </a:stretch>
@@ -24196,18 +24197,18 @@
           <wp:inline>
             <wp:extent cx="5334000" cy="2762989"/>
             <wp:effectExtent b="0" l="0" r="0" t="0"/>
-            <wp:docPr descr="Run overview for the full training run (Run ID bd518b21…, Duration 7.7h, Status Finished, Source run_xlsr_train.py)" title="" id="66" name="Picture"/>
+            <wp:docPr descr="Run overview for the full training run (Run ID bd518b21…, Duration 7.7h, Status Finished, Source run_xlsr_train.py)" title="" id="67" name="Picture"/>
             <a:graphic>
               <a:graphicData uri="http://schemas.openxmlformats.org/drawingml/2006/picture">
                 <pic:pic>
                   <pic:nvPicPr>
-                    <pic:cNvPr descr="appendix_screenshots/03_run_overview_7.7h.png" id="67" name="Picture"/>
+                    <pic:cNvPr descr="appendix_screenshots/03_run_overview_7.7h.png" id="68" name="Picture"/>
                     <pic:cNvPicPr>
                       <a:picLocks noChangeArrowheads="1" noChangeAspect="1"/>
                     </pic:cNvPicPr>
                   </pic:nvPicPr>
                   <pic:blipFill>
-                    <a:blip r:embed="rId65"/>
+                    <a:blip r:embed="rId66"/>
                     <a:stretch>
                       <a:fillRect/>
                     </a:stretch>
@@ -24251,18 +24252,18 @@
           <wp:inline>
             <wp:extent cx="5334000" cy="2836756"/>
             <wp:effectExtent b="0" l="0" r="0" t="0"/>
-            <wp:docPr descr="Model metrics: eval_wer curve (0.7098 → 0.6883 across the last four logged epochs) and train_loss (0.50)" title="" id="69" name="Picture"/>
+            <wp:docPr descr="Model metrics: eval_wer curve (0.7098 → 0.6883 across the last four logged epochs) and train_loss (0.50)" title="" id="70" name="Picture"/>
             <a:graphic>
               <a:graphicData uri="http://schemas.openxmlformats.org/drawingml/2006/picture">
                 <pic:pic>
                   <pic:nvPicPr>
-                    <pic:cNvPr descr="appendix_screenshots/05_model_metrics_eval_wer.png" id="70" name="Picture"/>
+                    <pic:cNvPr descr="appendix_screenshots/05_model_metrics_eval_wer.png" id="71" name="Picture"/>
                     <pic:cNvPicPr>
                       <a:picLocks noChangeArrowheads="1" noChangeAspect="1"/>
                     </pic:cNvPicPr>
                   </pic:nvPicPr>
                   <pic:blipFill>
-                    <a:blip r:embed="rId68"/>
+                    <a:blip r:embed="rId69"/>
                     <a:stretch>
                       <a:fillRect/>
                     </a:stretch>
@@ -24335,9 +24336,9 @@
         <w:t xml:space="preserve">store, per the reproducibility note above; only representative examples are shown here.)</w:t>
       </w:r>
     </w:p>
-    <w:bookmarkEnd w:id="71"/>
     <w:bookmarkEnd w:id="72"/>
-    <w:bookmarkStart w:id="81" w:name="appendix-d-extended-results-tables"/>
+    <w:bookmarkEnd w:id="73"/>
+    <w:bookmarkStart w:id="82" w:name="appendix-d-extended-results-tables"/>
     <w:p>
       <w:pPr>
         <w:pStyle w:val="Heading1"/>
@@ -24354,7 +24355,7 @@
         <w:t xml:space="preserve">Full machine-readable result files for every phase-4/7/8/9 measurement quoted in the report, plus the complete per-utterance error-analysis listing (150 utterances, Section 4.4), for independent verification beyond the summary tables in the main report body.</w:t>
       </w:r>
     </w:p>
-    <w:bookmarkStart w:id="79" w:name="d.1-summary-result-files"/>
+    <w:bookmarkStart w:id="80" w:name="d.1-summary-result-files"/>
     <w:p>
       <w:pPr>
         <w:pStyle w:val="Heading2"/>
@@ -24363,7 +24364,7 @@
         <w:t xml:space="preserve">D.1 Summary result files</w:t>
       </w:r>
     </w:p>
-    <w:bookmarkStart w:id="73" w:name="reportsphase4_audit_results.json"/>
+    <w:bookmarkStart w:id="74" w:name="reportsphase4_audit_results.json"/>
     <w:p>
       <w:pPr>
         <w:pStyle w:val="Heading3"/>
@@ -25178,8 +25179,8 @@
         <w:t xml:space="preserve">}</w:t>
       </w:r>
     </w:p>
-    <w:bookmarkEnd w:id="73"/>
-    <w:bookmarkStart w:id="74" w:name="reportsphase7_original_results.json"/>
+    <w:bookmarkEnd w:id="74"/>
+    <w:bookmarkStart w:id="75" w:name="reportsphase7_original_results.json"/>
     <w:p>
       <w:pPr>
         <w:pStyle w:val="Heading3"/>
@@ -25685,8 +25686,8 @@
         <w:t xml:space="preserve">}</w:t>
       </w:r>
     </w:p>
-    <w:bookmarkEnd w:id="74"/>
-    <w:bookmarkStart w:id="75" w:name="reportsphase7_finetuned_results.json"/>
+    <w:bookmarkEnd w:id="75"/>
+    <w:bookmarkStart w:id="76" w:name="reportsphase7_finetuned_results.json"/>
     <w:p>
       <w:pPr>
         <w:pStyle w:val="Heading3"/>
@@ -26192,8 +26193,8 @@
         <w:t xml:space="preserve">}</w:t>
       </w:r>
     </w:p>
-    <w:bookmarkEnd w:id="75"/>
-    <w:bookmarkStart w:id="76" w:name="reportsphase7_leaky_results.json"/>
+    <w:bookmarkEnd w:id="76"/>
+    <w:bookmarkStart w:id="77" w:name="reportsphase7_leaky_results.json"/>
     <w:p>
       <w:pPr>
         <w:pStyle w:val="Heading3"/>
@@ -26699,8 +26700,8 @@
         <w:t xml:space="preserve">}</w:t>
       </w:r>
     </w:p>
-    <w:bookmarkEnd w:id="76"/>
-    <w:bookmarkStart w:id="77" w:name="reportsphase8_efficiency_results.json"/>
+    <w:bookmarkEnd w:id="77"/>
+    <w:bookmarkStart w:id="78" w:name="reportsphase8_efficiency_results.json"/>
     <w:p>
       <w:pPr>
         <w:pStyle w:val="Heading3"/>
@@ -27707,8 +27708,8 @@
         <w:t xml:space="preserve">}</w:t>
       </w:r>
     </w:p>
-    <w:bookmarkEnd w:id="77"/>
-    <w:bookmarkStart w:id="78" w:name="Xfa4fd8cf3272c4e0fafe053cc535c38d359161e"/>
+    <w:bookmarkEnd w:id="78"/>
+    <w:bookmarkStart w:id="79" w:name="Xfa4fd8cf3272c4e0fafe053cc535c38d359161e"/>
     <w:p>
       <w:pPr>
         <w:pStyle w:val="Heading3"/>
@@ -33155,9 +33156,9 @@
         <w:t xml:space="preserve">}</w:t>
       </w:r>
     </w:p>
-    <w:bookmarkEnd w:id="78"/>
     <w:bookmarkEnd w:id="79"/>
-    <w:bookmarkStart w:id="80" w:name="X14ff4c5f56bd2bb354e131c7696c1b28d2e0219"/>
+    <w:bookmarkEnd w:id="80"/>
+    <w:bookmarkStart w:id="81" w:name="X14ff4c5f56bd2bb354e131c7696c1b28d2e0219"/>
     <w:p>
       <w:pPr>
         <w:pStyle w:val="Heading2"/>
@@ -46785,8 +46786,8 @@
         </w:tc>
       </w:tr>
     </w:tbl>
-    <w:bookmarkEnd w:id="80"/>
     <w:bookmarkEnd w:id="81"/>
+    <w:bookmarkEnd w:id="82"/>
     <w:sectPr>
       <w:footnotePr>
         <w:numRestart w:val="eachSect"/>

</xml_diff>